<commit_message>
Complete Ainekio software stack
</commit_message>
<xml_diff>
--- a/docs/Ainekio - System Specification v1.0.docx
+++ b/docs/Ainekio - System Specification v1.0.docx
@@ -24,7 +24,7 @@
         <w:rPr>
           <w:rtl w:val="0"/>
         </w:rPr>
-        <w:t xml:space="preserve">NORMATIVE SET: this file plus the Parts Overview (normative for electrical facts only; this file controls behavior). If a required fact is in neither, implementation stops for an errata. This v1.0 is a consolidation of Spec v0.6 + Amendment 1 with no intended behavioral changes; any discovered divergence from that lineage is a defect in this file. CHANGE CONTROL: this spec changes only via numbered errata for implementation-discovered defects (a clause that cannot be built, an internal contradiction found in code, or a test that cannot pass as written). RFC-2119 keywords. APPLIED ERRATUM E1 (2026-07-13): Sections 6.5, 6.7, A14, and H12 now define automatic WiFi fallback, single-network replacement, bounded status feedback, and network-only reset behavior that was previously unspecified.</w:t>
+        <w:t xml:space="preserve">NORMATIVE SET: this file plus the Parts Overview (normative for electrical facts only; this file controls behavior). If a required fact is in neither, implementation stops for an errata. This v1.0 is a consolidation of Spec v0.6 + Amendment 1 with no intended behavioral changes; any discovered divergence from that lineage is a defect in this file. CHANGE CONTROL: this spec changes only via numbered errata for implementation-discovered defects (a clause that cannot be built, an internal contradiction found in code, or a test that cannot pass as written). RFC-2119 keywords. APPLIED ERRATUM E1 (2026-07-13): Sections 6.5, 6.7, A14, and H12 now define automatic WiFi fallback, single-network replacement, bounded status feedback, and network-only reset behavior that was previously unspecified. APPLIED ERRATUM E2 (2026-07-13): Sections 2, 3.3, 5, 6.2, 6.8, 6.9, 8, 10, and 13 now define the Sesame-derived logical joint contract, required seed behavior parity, semantic emote control, compact motion and face assets, safe manual-controller behavior, calibration diagnostics, and parity acceptance gates.</w:t>
       </w:r>
     </w:p>
     <w:p>
@@ -318,7 +318,7 @@
         <w:rPr>
           <w:rtl w:val="0"/>
         </w:rPr>
-        <w:t xml:space="preserve">BRAIN: master computer and services. BODY: robot firmware, or the emulator standing in for it. INTENT: named high-level command. MOVEMENT_INTENT: {sit, stand, neutral, look, walk} - the only commands gated by S1 and the only commands that re-attach servos after a stop. SESSION: one WebSocket lifetime. EPOCH: integer the gateway increments per session. PROFILE: bandwidth policy (home, tether). CONTROL FRAME: text frame with one JSON object. MEDIA FRAME: binary frame. UTTERANCE: one streamed-speech unit bracketed by tts start/end.</w:t>
+        <w:t xml:space="preserve">BRAIN: master computer and services. BODY: robot firmware, or the emulator standing in for it. INTENT: named high-level command. MOVEMENT_INTENT: {sit, stand, neutral, look, walk, emote} - the only commands gated by S1 and the only commands that re-attach servos after a stop. EMOTE: a semantic named body-action asset; it never carries raw servo angles over the normal-operation protocol. SESSION: one WebSocket lifetime. EPOCH: integer the gateway increments per session. PROFILE: bandwidth policy (home, tether). CONTROL FRAME: text frame with one JSON object. MEDIA FRAME: binary frame. UTTERANCE: one streamed-speech unit bracketed by tts start/end.</w:t>
       </w:r>
     </w:p>
     <w:p>
@@ -443,7 +443,7 @@
         <w:rPr>
           <w:rtl w:val="0"/>
         </w:rPr>
-        <w:t xml:space="preserve">Normal operation: | message | example | constraints | | --- | --- | --- | | intent | {"t":"intent","seq":41,"name":"sit"} | names: sit, stand, neutral, look, walk, face, say | | intent look | {"t":"intent","seq":42,"name":"look","yaw":-30,"pitch":10,"ms":400} | yaw -90..90; pitch -45..45; ms 100..5000 default 400 | | intent walk | {"t":"intent","seq":43,"name":"walk","dir":"fwd","steps":2} | dir fwd/back/turn_l/turn_r; steps 1..10 | | intent face | {"t":"intent","seq":44,"name":"face","expr":"happy"} | asset name: [a-z0-9_]{1,32} | | intent say | {"t":"intent","seq":45,"name":"say","asset":"greeting_1"} | canned clip; streamed speech uses tts+0x10 | | stop | {"t":"stop","seq":46} | E-STOP, S7 | | tts | {"t":"tts","seq":47,"op":"start"} | op start/end/cancel; 3.6 | | cam | {"t":"cam","seq":48,"on":true,"fps":5,"res":"VGA"} | fps 0..15 (0 = snapshot-only); res QVGA/VGA | | snap | {"t":"snap","seq":49} | one frame now | | mic | {"t":"mic","seq":50,"on":true,"gate":"vad"} | gate open/vad/wake | | profile | {"t":"profile","seq":51,"name":"tether"} | home/tether | | state | {"t":"state","seq":52,"name":"doze"} | idle/doze/sleep; sleep requires sleep_s 60..86400: {"t":"state","seq":53,"name":"sleep","sleep_s":28800} | | ping | {"t":"ping"} | no seq; both directions |</w:t>
+        <w:t xml:space="preserve">Normal operation: | message | example | constraints | | --- | --- | --- | | intent | {"t":"intent","seq":41,"name":"sit"} | names: sit, stand, neutral, look, walk, emote, face, say | | intent look | {"t":"intent","seq":42,"name":"look","yaw":-30,"pitch":10,"ms":400} | yaw -90..90; pitch -45..45; ms 100..5000 default 400 | | intent walk | {"t":"intent","seq":43,"name":"walk","dir":"fwd","steps":2} | dir fwd/back/turn_l/turn_r; steps 1..10 | | intent emote | {"t":"intent","seq":44,"name":"emote","asset":"wave"} | semantic named body action; asset name [a-z0-9_]{1,32}; the body applies local safety, calibration, and limits; required seed catalog: rest, stand, wave, dance, swim, point, pushup, bow, cute, freaky, worm, shake, shrug, dead, crab | | intent face | {"t":"intent","seq":45,"name":"face","expr":"happy"} | asset name: [a-z0-9_]{1,32} | | intent say | {"t":"intent","seq":46,"name":"say","asset":"greeting_1"} | canned clip; streamed speech uses tts+0x10 | | stop | {"t":"stop","seq":47} | E-STOP, S7 | | tts | {"t":"tts","seq":48,"op":"start"} | op start/end/cancel; 3.6 | | cam | {"t":"cam","seq":49,"on":true,"fps":5,"res":"VGA"} | fps 0..15 (0 = snapshot-only); res QVGA/VGA | | snap | {"t":"snap","seq":50} | one frame now | | mic | {"t":"mic","seq":51,"on":true,"gate":"vad"} | gate open/vad/wake | | profile | {"t":"profile","seq":52,"name":"tether"} | home/tether | | state | {"t":"state","seq":53,"name":"doze"} | idle/doze/sleep; sleep requires sleep_s 60..86400: {"t":"state","seq":54,"name":"sleep","sleep_s":28800} | | ping | {"t":"ping"} | no seq; both directions |</w:t>
       </w:r>
     </w:p>
     <w:p>
@@ -1769,7 +1769,7 @@
         <w:rPr>
           <w:rtl w:val="0"/>
         </w:rPr>
-        <w:t xml:space="preserve">IDLE: idle animations from flash; any intent or snap -&gt; ACTIVE and executes.</w:t>
+        <w:t xml:space="preserve">IDLE: idle animations from flash; any intent or snap -&gt; ACTIVE and executes. The required seed display behavior uses the idle face in boomerang mode, schedules a blink 3-7 s later, gives each blink a 30 percent chance of one additional blink 120-220 ms later, and repeats while IDLE. Tests use a seeded random source. Missing optional idle assets fall back to the compiled default face and do not block state transitions.</w:t>
       </w:r>
     </w:p>
     <w:p>
@@ -1878,7 +1878,7 @@
         <w:rPr>
           <w:rtl w:val="0"/>
         </w:rPr>
-        <w:t xml:space="preserve">MCPWM ONLY - LEDC is consumed by camera XCLK; libraries that silently allocate LEDC (e.g., ESP32Servo) are forbidden. 50 Hz, 500-2500 us mapped to calibrated degrees, linear interpolation at the 50 Hz tick, per-servo detach, outputs high-impedance until S6 attach. Bring-up produces an allocation table (unit, timer, operator, comparator, generator, GPIO, servo id, detach behavior) verified against the TRM/soc headers, plus a test driving all 8 outputs independently and detaching each independently.</w:t>
+        <w:t xml:space="preserve">MCPWM ONLY - LEDC is consumed by camera XCLK; libraries that silently allocate LEDC (e.g., ESP32Servo) are forbidden. 50 Hz, 500-2500 us mapped to calibrated degrees, linear interpolation at the 50 Hz tick, per-servo detach, outputs high-impedance until S6 attach. Bring-up produces an allocation table (unit, timer, operator, comparator, generator, GPIO, servo id, detach behavior) verified against the TRM/soc headers, plus a test driving all 8 outputs independently and detaching each independently. LOGICAL JOINT CONTRACT: servo ids are frozen as 0=R1, 1=R2, 2=L1, 3=L2, 4=R4, 5=R3, 6=L3, 7=L4. Motion assets contain logical ids only. One platform configuration maps each logical id to GPIO, physical joint label, positive-angle direction, invert, center, minimum, and maximum; calibrated mapping occurs before PWM generation. H2 records the physical joint diagram and verifies that each id and positive direction match this contract. Raw Sesame seed angles are never written directly to PWM without this mapping and S3 limit enforcement.</w:t>
       </w:r>
     </w:p>
     <w:p>
@@ -2028,7 +2028,7 @@
         <w:rPr>
           <w:rtl w:val="0"/>
         </w:rPr>
-        <w:t xml:space="preserve">One I2S controller, full duplex, 16 kHz s16le mono, DMA both directions. Mic: DMA -&gt; VAD (energy + hangover; ESP-SR WakeNet is the designed-for upgrade) -&gt; 0x01 when the gate is open. Speaker: single consumer of the ordered speaker stream, mixing streamed utterances and LittleFS assets (never concurrently); underrun plays silence without reordering; spk_underruns and mic_drops reported in status.</w:t>
+        <w:t xml:space="preserve">One I2S controller, full duplex, 16 kHz s16le mono, DMA both directions. Mic: DMA -&gt; VAD (energy + hangover; ESP-SR WakeNet is the designed-for upgrade) -&gt; 0x01 when the gate is open. Speaker: single consumer of the ordered speaker stream, mixing streamed utterances and LittleFS assets (never concurrently); underrun plays silence without reordering; spk_underruns and mic_drops reported in status. DISPLAY DURING SPEECH: if a matching talk_* face exists, tts start selects it and tts completion, cancellation, stop, or overflow restores the prior non-talk face. A missing talk face never fails or delays audio.</w:t>
       </w:r>
     </w:p>
     <w:p>
@@ -2053,7 +2053,7 @@
         <w:rPr>
           <w:rtl w:val="0"/>
         </w:rPr>
-        <w:t xml:space="preserve">esp_littlefs (joltwallet), exact version pinned in the manifest, mount /assets, images built with mklittlefs in CI and verified as a CI artifact. Mount failure per S8.</w:t>
+        <w:t xml:space="preserve">esp_littlefs (joltwallet), exact version pinned in the manifest, mount /assets, images built with mklittlefs in CI and verified as a CI artifact. Mount failure per S8. ASSET OWNERSHIP: multi-frame motion sequences, OLED frames, and canned sounds live in LittleFS so they do not consume either 3 MB OTA application slot; only neutral, stand, stop, and one default face are compiled fallbacks. MOTION ASSET FORMAT: a versioned bounded record contains asset name, joint-map version, optional face cue and animation mode, 1-256 frames, each frame duration 20-5000 ms, a subset of the eight logical target angles, and a bounded repeat count 1-16. No asset may encode an unbounded loop. The loader validates schema, ids, finite values, duration, total expanded frames, and calibrated limits before making an asset executable; invalid assets are unavailable and follow S8 asset_missing behavior. NVS pose_save remains a calibration-time static-pose override; multi-frame sequences remain LittleFS assets in v1. SEED MOTION CATALOG: rest, stand, wave, dance, swim, point, pushup, bow, cute, freaky, worm, shake, shrug, dead, crab, walk forward, walk backward, turn left, and turn right are converted from the original Sesame movement-sequences.h source of truth. Emulator fixtures preserve logical targets, holds, repeats, return pose, and face cues exactly; physical firmware applies center/invert/min/max calibration and S1-S7, so behavioral parity never bypasses safety. FACE ASSET FORMAT: a manifest entry contains a normalized name, 1-6 128x64 1-bit frames, fps 1-30, and mode loop, once, or boomerang. Required seed names are walk, rest, swim, dance, wave, point, stand, cute, pushup, freaky, bow, worm, shake, shrug, dead, crab, default, idle, idle_blink, happy, talk_happy, sad, talk_sad, angry, talk_angry, surprised, talk_surprised, sleepy, talk_sleepy, love, talk_love, excited, talk_excited, confused, talk_confused, thinking, and talk_thinking. The legacy misspelling defualt is accepted only as an import alias and is normalized to default.</w:t>
       </w:r>
     </w:p>
     <w:p>
@@ -2139,7 +2139,7 @@
         <w:rPr>
           <w:rtl w:val="0"/>
         </w:rPr>
-        <w:t xml:space="preserve">Dashboard (auth required): no default password anywhere in the repo; first run generates a password stored as a salted hash/verifier (never plaintext) in an auth file - POSIX 0600, Windows ACL owner+Administrators only - with the plaintext shown once, only on an interactive TTY, never through any logger; reset by deleting the auth file. Sessions: HttpOnly + SameSite=Strict cookie; login rate limit 5/min; logout endpoint. Audit log: login failures; stop issued; stop cleared (= first accepted MOVEMENT_INTENT after a stop). Panels: connection status + heartbeat age; always-visible E-STOP labeled "signal stop"; manual intents; calibration UI; camera panel (snapshot + low-fps); mic level meter + speaker test; battery/RSSI; effective caps; command/event log; SD panel (mount state, retry, authenticated reformat, clear recordings). Single-user acceptable in v1.</w:t>
+        <w:t xml:space="preserve">Dashboard (auth required): no default password anywhere in the repo; first run generates a password stored as a salted hash/verifier (never plaintext) in an auth file - POSIX 0600, Windows ACL owner+Administrators only - with the plaintext shown once, only on an interactive TTY, never through any logger; reset by deleting the auth file. Sessions: HttpOnly + SameSite=Strict cookie; login rate limit 5/min; logout endpoint. Audit log: login failures; stop issued; stop cleared (= first accepted MOVEMENT_INTENT after a stop). Panels: connection status + heartbeat age; always-visible E-STOP labeled "signal stop"; manual intents including the full required seed emote catalog; keyboard/touch D-pad and Web Gamepad API controls; press or hold may issue at most one bounded walk command at a time, while release, axis-neutral, browser blur, controller disconnect, or control-page loss immediately signals stop without waiting behind another command; displayed and editable controller mappings; current command lifecycle and face feedback; calibration UI with logical joint labels, single-joint test, all-neutral, and detach controls; camera panel (snapshot + low-fps); mic level meter + speaker test; battery/RSSI; effective caps; command/event log; SD panel (mount state, retry, authenticated reformat, clear recordings). Single-user acceptable in v1.</w:t>
       </w:r>
     </w:p>
     <w:p>
@@ -2630,6 +2630,81 @@
     </w:p>
     <w:p>
       <w:pPr>
+        <w:numPr>
+          <w:ilvl w:val="0"/>
+          <w:numId w:val="1"/>
+        </w:numPr>
+        <w:ind w:left="720" w:hanging="360"/>
+      </w:pPr>
+      <w:r>
+        <w:rPr>
+          <w:rtl w:val="0"/>
+        </w:rPr>
+        <w:t xml:space="preserve">A26 logical joint contract: ids 0..7 map to R1,R2,L1,L2,R4,R3,L3,L4 in schema, emulator, asset loader, dashboard, and platform configuration; duplicate, missing, or mismatched joint-map versions reject before execution.</w:t>
+      </w:r>
+    </w:p>
+    <w:p>
+      <w:pPr>
+        <w:numPr>
+          <w:ilvl w:val="0"/>
+          <w:numId w:val="1"/>
+        </w:numPr>
+        <w:ind w:left="720" w:hanging="360"/>
+      </w:pPr>
+      <w:r>
+        <w:rPr>
+          <w:rtl w:val="0"/>
+        </w:rPr>
+        <w:t xml:space="preserve">A27 Sesame seed motion parity: all 19 required seed routines match movement-sequences.h logical targets, frame holds, repeat counts, return pose, and face cues in deterministic emulator fixtures; each routine remains preemptible by stop and every expanded target passes calibrated limits.</w:t>
+      </w:r>
+    </w:p>
+    <w:p>
+      <w:pPr>
+        <w:numPr>
+          <w:ilvl w:val="0"/>
+          <w:numId w:val="1"/>
+        </w:numPr>
+        <w:ind w:left="720" w:hanging="360"/>
+      </w:pPr>
+      <w:r>
+        <w:rPr>
+          <w:rtl w:val="0"/>
+        </w:rPr>
+        <w:t xml:space="preserve">A28 display parity: required face manifest loads all normalized seed names; loop/once/boomerang and per-face fps behave deterministically; IDLE blink bounds and seeded double blink pass; tts talk-face selection and restoration never delay audio.</w:t>
+      </w:r>
+    </w:p>
+    <w:p>
+      <w:pPr>
+        <w:numPr>
+          <w:ilvl w:val="0"/>
+          <w:numId w:val="1"/>
+        </w:numPr>
+        <w:ind w:left="720" w:hanging="360"/>
+      </w:pPr>
+      <w:r>
+        <w:rPr>
+          <w:rtl w:val="0"/>
+        </w:rPr>
+        <w:t xml:space="preserve">A29 manual controls: mouse, touch, keyboard, and gamepad use semantic commands only; held movement keeps at most one bounded walk in flight; release, neutral axis, blur, disconnect, and page loss signal stop; emote buttons expose the full seed catalog.</w:t>
+      </w:r>
+    </w:p>
+    <w:p>
+      <w:pPr>
+        <w:numPr>
+          <w:ilvl w:val="0"/>
+          <w:numId w:val="1"/>
+        </w:numPr>
+        <w:ind w:left="720" w:hanging="360"/>
+      </w:pPr>
+      <w:r>
+        <w:rPr>
+          <w:rtl w:val="0"/>
+        </w:rPr>
+        <w:t xml:space="preserve">A30 calibration diagnostics: dashboard identifies joints by logical name and id, exercises each joint individually, commands all-neutral through calibrated limits, detaches outputs, and persists center/invert/min/max atomically without exposing raw-servo control outside calibration mode.</w:t>
+      </w:r>
+    </w:p>
+    <w:p>
+      <w:pPr>
         <w:keepNext w:val="0"/>
         <w:keepLines w:val="0"/>
         <w:pageBreakBefore w:val="0"/>
@@ -2901,6 +2976,21 @@
     </w:p>
     <w:p>
       <w:pPr>
+        <w:numPr>
+          <w:ilvl w:val="0"/>
+          <w:numId w:val="1"/>
+        </w:numPr>
+        <w:ind w:left="720" w:hanging="360"/>
+      </w:pPr>
+      <w:r>
+        <w:rPr>
+          <w:rtl w:val="0"/>
+        </w:rPr>
+        <w:t xml:space="preserve">H15 joint and seed-motion smoke: the recorded joint diagram proves each logical id selects the labelled physical joint and positive-angle direction; supervised rest, stand, walk forward/backward, turn left/right, and wave remain inside calibrated limits, return to the specified pose, and stop safely on controller release.</w:t>
+      </w:r>
+    </w:p>
+    <w:p>
+      <w:pPr>
         <w:pStyle w:val="Heading2"/>
         <w:rPr/>
       </w:pPr>
@@ -2971,7 +3061,7 @@
         <w:rPr>
           <w:rtl w:val="0"/>
         </w:rPr>
-        <w:t xml:space="preserve">[ ] Extract bridge client + action translation into gateway/bridge_client. [ ] Old adapter CLI marked simulator-only in help text and docs. [ ] Guard test A25 in CI. [ ] Old TTL behavior superseded by max_action_age_ms. [ ] motion/ sequence data optionally converted to seed firmware pose tables (NVS is the runtime source of truth). [ ] Stale PCA9685/Pi references removed or marked historical. [ ] docs/README.md names this file + Parts Overview as the normative set; older specs archived.</w:t>
+        <w:t xml:space="preserve">[ ] Extract bridge client + action translation into gateway/bridge_client. [ ] Old adapter CLI marked simulator-only in help text and docs. [ ] Guard test A25 in CI. [ ] Old TTL behavior superseded by max_action_age_ms. [ ] Freeze logical joint ids as 0=R1,1=R2,2=L1,3=L2,4=R4,5=R3,6=L3,7=L4 across protocol, emulator, dashboard, and firmware. [ ] Add the semantic emote intent and shared schema/fixture coverage. [ ] Convert all 19 required routines from movement-sequences.h into versioned LittleFS seed assets and exact emulator parity fixtures; do not use the drifted legacy Python approximation as source of truth. [ ] Import and normalize the required face catalog, animation metadata, motion-face cues, idle blink behavior, and talk-face lifecycle into LittleFS assets. [ ] Recreate the old touch and gamepad ergonomics in the authenticated gateway dashboard using bounded semantic walk commands and direct stop-on-release; do not restore raw normal-mode servo endpoints. [ ] Translate legacy subtrim concepts into logical-joint center/invert/min/max calibration defaults and diagnostics; NVS remains the runtime source of calibration and static pose overrides. [ ] Stale PCA9685/Pi references removed or marked historical. [ ] docs/README.md names this file + Parts Overview as the normative set; older specs archived.</w:t>
       </w:r>
     </w:p>
     <w:p>

</xml_diff>